<commit_message>
Desglose 1 RFC, honorarios, tiempos; ID en lugar de pasaporte
</commit_message>
<xml_diff>
--- a/gr-tax-legal-presentacion/docs/certificado-notarial-modelo.docx
+++ b/gr-tax-legal-presentacion/docs/certificado-notarial-modelo.docx
@@ -102,7 +102,7 @@
         <w:jc w:val="both"/>
       </w:pPr>
       <w:r>
-        <w:t>7. [OPTIONAL] [IDENTITY DOCUMENT TYPE, e.g. People’s Republic of China Resident Identity Card / Passport] No. [ID NUMBER] of [SIGNER NAME] together with its Spanish translation; and</w:t>
+        <w:t>7. [OPTIONAL] [IDENTITY DOCUMENT TYPE, e.g. People’s Republic of China Resident Identity Card] No. [ID NUMBER] of [SIGNER NAME] together with its Spanish translation; and</w:t>
       </w:r>
     </w:p>
     <w:p>
@@ -276,7 +276,7 @@
         <w:jc w:val="both"/>
       </w:pPr>
       <w:r>
-        <w:t>7. [OPCIONAL] [TIPO DE DOCUMENTO DE IDENTIDAD, p. ej. Tarjeta de Identidad de Residente de la República Popular China / Pasaporte] No. [NÚMERO] de [NOMBRE DEL FIRMANTE], junto con su traducción al español; y</w:t>
+        <w:t>7. [OPCIONAL] [TIPO DE DOCUMENTO DE IDENTIDAD, p. ej. Tarjeta de Identidad de Residente de la República Popular China] No. [NÚMERO] de [NOMBRE DEL FIRMANTE], junto con su traducción al español; y</w:t>
       </w:r>
     </w:p>
     <w:p>

</xml_diff>

<commit_message>
Contrato sin IVA en montos; certificado modelo con 6 documentos
</commit_message>
<xml_diff>
--- a/gr-tax-legal-presentacion/docs/certificado-notarial-modelo.docx
+++ b/gr-tax-legal-presentacion/docs/certificado-notarial-modelo.docx
@@ -48,7 +48,7 @@
         <w:jc w:val="both"/>
       </w:pPr>
       <w:r>
-        <w:t>1. Certificate of Change of Name of the Company in respect of the change of company name from [FORMER COMPANY NAME] to [COMPANY NAME] dated [DATE] together with its Spanish translation;</w:t>
+        <w:t>1. Certificate of Incorporation of [COMPANY NAME] dated [DATE] together with its Spanish translation;</w:t>
       </w:r>
     </w:p>
     <w:p>
@@ -66,7 +66,7 @@
         <w:jc w:val="both"/>
       </w:pPr>
       <w:r>
-        <w:t>3. Incorporation Form (Company Limited by Shares) (Form NC1) of [COMPANY NAME AT INCORPORATION] dated [DATE] together with its Spanish translation;</w:t>
+        <w:t>3. Incorporation Form (Company Limited by Shares) (Form NNC1) of [COMPANY NAME] dated [DATE] together with its Spanish translation;</w:t>
       </w:r>
     </w:p>
     <w:p>
@@ -75,7 +75,7 @@
         <w:jc w:val="both"/>
       </w:pPr>
       <w:r>
-        <w:t>4. Notice of Change of Company Name (Form NNC2) of [FORMER COMPANY NAME] dated [DATE] together with its Spanish translation;</w:t>
+        <w:t>4. Articles of Association of [COMPANY NAME] together with its Spanish translation;</w:t>
       </w:r>
     </w:p>
     <w:p>
@@ -84,7 +84,7 @@
         <w:jc w:val="both"/>
       </w:pPr>
       <w:r>
-        <w:t>5. Notice of Change of Company Name (Form NNC2) of [COMPANY NAME] dated [DATE] together with its Spanish translation;</w:t>
+        <w:t>5. Power of Attorney signed by [SIGNER NAME] for and on behalf of [COMPANY NAME] dated [DATE] together with its Spanish translation; and</w:t>
       </w:r>
     </w:p>
     <w:p>
@@ -93,25 +93,7 @@
         <w:jc w:val="both"/>
       </w:pPr>
       <w:r>
-        <w:t>6. General Power of Attorney of [COMPANY NAME] dated [DATE] together with its Spanish translation; and</w:t>
-      </w:r>
-    </w:p>
-    <w:p>
-      <w:pPr>
-        <w:ind w:left="567"/>
-        <w:jc w:val="both"/>
-      </w:pPr>
-      <w:r>
-        <w:t>7. [OPTIONAL] [IDENTITY DOCUMENT TYPE, e.g. People’s Republic of China Resident Identity Card] No. [ID NUMBER] of [SIGNER NAME] together with its Spanish translation; and</w:t>
-      </w:r>
-    </w:p>
-    <w:p>
-      <w:pPr>
-        <w:ind w:left="567"/>
-        <w:jc w:val="both"/>
-      </w:pPr>
-      <w:r>
-        <w:t>8. [OTHER DOCUMENT, IF ANY] together with its Spanish translation.</w:t>
+        <w:t>6. [IDENTITY DOCUMENT TYPE, e.g. People’s Republic of China Resident Identity Card] No. [ID NUMBER] of [SIGNER NAME] together with its Spanish translation.</w:t>
       </w:r>
     </w:p>
     <w:p>
@@ -222,7 +204,7 @@
         <w:jc w:val="both"/>
       </w:pPr>
       <w:r>
-        <w:t>1. Certificado de Cambio de Denominación de la Sociedad, respecto del cambio de denominación de [DENOMINACIÓN ANTERIOR] a [NOMBRE DE LA EMPRESA], de fecha [FECHA], junto con su traducción al español;</w:t>
+        <w:t>1. Certificado de Constitución de [NOMBRE DE LA EMPRESA], de fecha [FECHA], junto con su traducción al español;</w:t>
       </w:r>
     </w:p>
     <w:p>
@@ -240,7 +222,7 @@
         <w:jc w:val="both"/>
       </w:pPr>
       <w:r>
-        <w:t>3. Formulario de Constitución (Sociedad Limitada por Acciones) (Formulario NC1) de [DENOMINACIÓN AL CONSTITUIRSE], de fecha [FECHA], junto con su traducción al español;</w:t>
+        <w:t>3. Formulario de Constitución (Sociedad Limitada por Acciones) (Formulario NNC1) de [NOMBRE DE LA EMPRESA], de fecha [FECHA], junto con su traducción al español;</w:t>
       </w:r>
     </w:p>
     <w:p>
@@ -249,7 +231,7 @@
         <w:jc w:val="both"/>
       </w:pPr>
       <w:r>
-        <w:t>4. Aviso de Cambio de Denominación (Formulario NNC2) de [DENOMINACIÓN ANTERIOR], de fecha [FECHA], junto con su traducción al español;</w:t>
+        <w:t>4. Estatutos Sociales (Articles of Association) de [NOMBRE DE LA EMPRESA], junto con su traducción al español;</w:t>
       </w:r>
     </w:p>
     <w:p>
@@ -258,7 +240,7 @@
         <w:jc w:val="both"/>
       </w:pPr>
       <w:r>
-        <w:t>5. Aviso de Cambio de Denominación (Formulario NNC2) de [NOMBRE DE LA EMPRESA], de fecha [FECHA], junto con su traducción al español;</w:t>
+        <w:t>5. Poder firmado por [NOMBRE DEL FIRMANTE] en nombre y representación de [NOMBRE DE LA EMPRESA], de fecha [FECHA], junto con su traducción al español; y</w:t>
       </w:r>
     </w:p>
     <w:p>
@@ -267,25 +249,7 @@
         <w:jc w:val="both"/>
       </w:pPr>
       <w:r>
-        <w:t>6. Poder General de [NOMBRE DE LA EMPRESA], de fecha [FECHA], junto con su traducción al español; y</w:t>
-      </w:r>
-    </w:p>
-    <w:p>
-      <w:pPr>
-        <w:ind w:left="567"/>
-        <w:jc w:val="both"/>
-      </w:pPr>
-      <w:r>
-        <w:t>7. [OPCIONAL] [TIPO DE DOCUMENTO DE IDENTIDAD, p. ej. Tarjeta de Identidad de Residente de la República Popular China] No. [NÚMERO] de [NOMBRE DEL FIRMANTE], junto con su traducción al español; y</w:t>
-      </w:r>
-    </w:p>
-    <w:p>
-      <w:pPr>
-        <w:ind w:left="567"/>
-        <w:jc w:val="both"/>
-      </w:pPr>
-      <w:r>
-        <w:t>8. [OTRO DOCUMENTO, EN SU CASO], junto con su traducción al español.</w:t>
+        <w:t>6. [TIPO DE DOCUMENTO DE IDENTIDAD, p. ej. Tarjeta de Identidad de Residente de la República Popular China] No. [NÚMERO] de [NOMBRE DEL FIRMANTE], junto con su traducción al español.</w:t>
       </w:r>
     </w:p>
     <w:p>
@@ -351,7 +315,7 @@
           <w:i/>
           <w:sz w:val="20"/>
         </w:rPr>
-        <w:t>[Nota: Modelo de referencia basado en el formato usado en Hong Kong. Los puntos 1, 4 y 5 solo aplican si la empresa cambió de denominación; el punto 7 es opcional (documento de identidad del firmante); elimine los que no correspondan y renumere. El certificado lo emite en inglés el notario del país de origen y debe apostillarse allí; ambos trámites y las traducciones hechas en el país de origen corren a cargo y costo del cliente, quien lo entrega ya concluido. G&amp;R TAX-LEGAL CONSULTING coordina únicamente la traducción al español por perito traductor autorizado por el Poder Judicial de la Federación o por el Tribunal Superior de Justicia de la Ciudad de México. La traducción al español mostrada es solo de referencia.]</w:t>
+        <w:t>[Nota: Modelo de referencia basado en el formato usado en Hong Kong. Los seis puntos corresponden a los documentos del Anexo C del contrato. Si la empresa cambió de denominación, agregue el Certificate of Change of Name y el Form NNC2 (Notice of Change of Company Name), cada uno con su traducción al español. El certificado lo emite en inglés el notario del país de origen y debe apostillarse allí; ambos trámites y las traducciones hechas en el país de origen corren a cargo y costo del cliente, quien lo entrega ya concluido. G&amp;R TAX-LEGAL CONSULTING coordina únicamente la traducción al español por perito traductor autorizado por el Poder Judicial de la Federación o por el Tribunal Superior de Justicia de la Ciudad de México. La traducción al español mostrada es solo de referencia.]</w:t>
       </w:r>
     </w:p>
     <w:p>

</xml_diff>